<commit_message>
Add documentation, scripts, and screenshots
Add comprehensive project documentation and assets for HRCP-KKU-Academic: new Chapter 3 methodology (MD and DOCX, Thai), system sequence diagram images, UI design and SSD description DOCX files, many UI/screenshots, and generated doc preview scripts (generate_descriptions.py, generate_ui_docs.py) with compiled __pycache__ entries. Also update uploads/academic/doc_8.docx and add uploads/academic/9/doc_1.docx. These files provide documentation, visuals, and tooling for generating UI/docs for the project.
</commit_message>
<xml_diff>
--- a/HRCP-KKU-Academic/uploads/academic/8/doc_8.docx
+++ b/HRCP-KKU-Academic/uploads/academic/8/doc_8.docx
@@ -358,7 +358,7 @@
           <w:sz w:val="32"/>
           <w:szCs w:val="32"/>
         </w:rPr>
-        <w:t>10 มีนาคม 2569</w:t>
+        <w:t>12 มีนาคม 2569</w:t>
       </w:r>
       <w:r>
         <w:rPr>
@@ -586,7 +586,7 @@
           <w:sz w:val="32"/>
           <w:szCs w:val="32"/>
         </w:rPr>
-        <w:t>10 มีนาคม 2569</w:t>
+        <w:t>12 มีนาคม 2569</w:t>
       </w:r>
       <w:r>
         <w:rPr>
@@ -1286,7 +1286,7 @@
           <w:sz w:val="32"/>
           <w:szCs w:val="32"/>
         </w:rPr>
-        <w:t/>
+        <w:t>12 มีนาคม 2572</w:t>
       </w:r>
       <w:r>
         <w:rPr>

</xml_diff>